<commit_message>
feat(mcap): overhaul MCAP practice — official styling, CCSS labels, accurate wording
- math/mcap-practice: restyle interactive Grade 6 test to official-MCAP look,
  surface CCSS per item, tighten wording, fix duplicate-choice/ambiguity defects
- per-lesson printables: new single-source generator (scripts/generate-mcap-practice.mjs
  + scripts/mcap-practice/ data extracted from the 51 DOCX); regenerate all 51 with
  polished cards + clearly separated CCSS labels (fixes run-together 'LessonX-YCCSS')
- mcap-review: upgrade packet generator (HTML+DOCX) to official-MCAP styling with
  CCSS shown on every skill/item; regenerate packets + hub
</commit_message>
<xml_diff>
--- a/mcap-review/packets/expressions-equations/6-ee-a-1.docx
+++ b/mcap-review/packets/expressions-equations/6-ee-a-1.docx
@@ -1401,312 +1401,789 @@
         <w:t xml:space="preserve">MCAP-Style Practice</w:t>
       </w:r>
     </w:p>
-    <w:p>
-      <w:pPr>
-        <w:spacing w:after="80"/>
-      </w:pPr>
-      <w:r>
-        <w:rPr>
-          <w:rFonts w:ascii="Calibri" w:cs="Calibri" w:eastAsia="Calibri" w:hAnsi="Calibri"/>
-          <w:i/>
-          <w:iCs/>
-          <w:color w:val="5F6F80"/>
-          <w:sz w:val="19"/>
-          <w:szCs w:val="19"/>
-        </w:rPr>
-        <w:t xml:space="preserve">Bubble the best answer or fill in the blank, just like on the test.</w:t>
-      </w:r>
-    </w:p>
-    <w:p>
-      <w:pPr>
-        <w:spacing w:after="40" w:before="120"/>
-      </w:pPr>
-      <w:r>
-        <w:rPr>
-          <w:rFonts w:ascii="Calibri" w:cs="Calibri" w:eastAsia="Calibri" w:hAnsi="Calibri"/>
-          <w:b/>
-          <w:bCs/>
-          <w:color w:val="12355B"/>
-          <w:sz w:val="21"/>
-          <w:szCs w:val="21"/>
-        </w:rPr>
-        <w:t xml:space="preserve">1.  </w:t>
-      </w:r>
-      <w:r>
-        <w:rPr>
-          <w:rFonts w:ascii="Calibri" w:cs="Calibri" w:eastAsia="Calibri" w:hAnsi="Calibri"/>
-          <w:color w:val="1A2733"/>
-          <w:sz w:val="21"/>
-          <w:szCs w:val="21"/>
-        </w:rPr>
-        <w:t xml:space="preserve">Which expression is equal to 2³?</w:t>
-      </w:r>
-    </w:p>
-    <w:p>
-      <w:pPr>
-        <w:spacing w:after="20"/>
-        <w:ind w:left="360"/>
-      </w:pPr>
-      <w:r>
-        <w:rPr>
-          <w:rFonts w:ascii="Calibri" w:cs="Calibri" w:eastAsia="Calibri" w:hAnsi="Calibri"/>
-          <w:color w:val="1A2733"/>
-          <w:sz w:val="20"/>
-          <w:szCs w:val="20"/>
-        </w:rPr>
-        <w:t xml:space="preserve">  ◯  A.  </w:t>
-      </w:r>
-      <w:r>
-        <w:rPr>
-          <w:rFonts w:ascii="Calibri" w:cs="Calibri" w:eastAsia="Calibri" w:hAnsi="Calibri"/>
-          <w:color w:val="1A2733"/>
-          <w:sz w:val="20"/>
-          <w:szCs w:val="20"/>
-        </w:rPr>
-        <w:t xml:space="preserve">2 × 3</w:t>
-      </w:r>
-    </w:p>
-    <w:p>
-      <w:pPr>
-        <w:spacing w:after="20"/>
-        <w:ind w:left="360"/>
-      </w:pPr>
-      <w:r>
-        <w:rPr>
-          <w:rFonts w:ascii="Calibri" w:cs="Calibri" w:eastAsia="Calibri" w:hAnsi="Calibri"/>
-          <w:color w:val="1A2733"/>
-          <w:sz w:val="20"/>
-          <w:szCs w:val="20"/>
-        </w:rPr>
-        <w:t xml:space="preserve">  ◯  B.  </w:t>
-      </w:r>
-      <w:r>
-        <w:rPr>
-          <w:rFonts w:ascii="Calibri" w:cs="Calibri" w:eastAsia="Calibri" w:hAnsi="Calibri"/>
-          <w:color w:val="1A2733"/>
-          <w:sz w:val="20"/>
-          <w:szCs w:val="20"/>
-        </w:rPr>
-        <w:t xml:space="preserve">2 + 2 + 2</w:t>
-      </w:r>
-    </w:p>
-    <w:p>
-      <w:pPr>
-        <w:spacing w:after="20"/>
-        <w:ind w:left="360"/>
-      </w:pPr>
-      <w:r>
-        <w:rPr>
-          <w:rFonts w:ascii="Calibri" w:cs="Calibri" w:eastAsia="Calibri" w:hAnsi="Calibri"/>
-          <w:color w:val="1A2733"/>
-          <w:sz w:val="20"/>
-          <w:szCs w:val="20"/>
-        </w:rPr>
-        <w:t xml:space="preserve">  ◯  C.  </w:t>
-      </w:r>
-      <w:r>
-        <w:rPr>
-          <w:rFonts w:ascii="Calibri" w:cs="Calibri" w:eastAsia="Calibri" w:hAnsi="Calibri"/>
-          <w:color w:val="1A2733"/>
-          <w:sz w:val="20"/>
-          <w:szCs w:val="20"/>
-        </w:rPr>
-        <w:t xml:space="preserve">2 × 2 × 2</w:t>
-      </w:r>
-    </w:p>
-    <w:p>
-      <w:pPr>
-        <w:spacing w:after="20"/>
-        <w:ind w:left="360"/>
-      </w:pPr>
-      <w:r>
-        <w:rPr>
-          <w:rFonts w:ascii="Calibri" w:cs="Calibri" w:eastAsia="Calibri" w:hAnsi="Calibri"/>
-          <w:color w:val="1A2733"/>
-          <w:sz w:val="20"/>
-          <w:szCs w:val="20"/>
-        </w:rPr>
-        <w:t xml:space="preserve">  ◯  D.  </w:t>
-      </w:r>
-      <w:r>
-        <w:rPr>
-          <w:rFonts w:ascii="Calibri" w:cs="Calibri" w:eastAsia="Calibri" w:hAnsi="Calibri"/>
-          <w:color w:val="1A2733"/>
-          <w:sz w:val="20"/>
-          <w:szCs w:val="20"/>
-        </w:rPr>
-        <w:t xml:space="preserve">3 × 3</w:t>
-      </w:r>
-    </w:p>
-    <w:p>
-      <w:pPr>
-        <w:spacing w:after="40" w:before="120"/>
-      </w:pPr>
-      <w:r>
-        <w:rPr>
-          <w:rFonts w:ascii="Calibri" w:cs="Calibri" w:eastAsia="Calibri" w:hAnsi="Calibri"/>
-          <w:b/>
-          <w:bCs/>
-          <w:color w:val="12355B"/>
-          <w:sz w:val="21"/>
-          <w:szCs w:val="21"/>
-        </w:rPr>
-        <w:t xml:space="preserve">2.  </w:t>
-      </w:r>
-      <w:r>
-        <w:rPr>
-          <w:rFonts w:ascii="Calibri" w:cs="Calibri" w:eastAsia="Calibri" w:hAnsi="Calibri"/>
-          <w:color w:val="1A2733"/>
-          <w:sz w:val="21"/>
-          <w:szCs w:val="21"/>
-        </w:rPr>
-        <w:t xml:space="preserve">What is the value of 5²?</w:t>
-      </w:r>
-    </w:p>
-    <w:p>
-      <w:pPr>
-        <w:spacing w:after="20"/>
-        <w:ind w:left="360"/>
-      </w:pPr>
-      <w:r>
-        <w:rPr>
-          <w:rFonts w:ascii="Calibri" w:cs="Calibri" w:eastAsia="Calibri" w:hAnsi="Calibri"/>
-          <w:color w:val="1A2733"/>
-          <w:sz w:val="20"/>
-          <w:szCs w:val="20"/>
-        </w:rPr>
-        <w:t xml:space="preserve">  ◯  A.  </w:t>
-      </w:r>
-      <w:r>
-        <w:rPr>
-          <w:rFonts w:ascii="Calibri" w:cs="Calibri" w:eastAsia="Calibri" w:hAnsi="Calibri"/>
-          <w:color w:val="1A2733"/>
-          <w:sz w:val="20"/>
-          <w:szCs w:val="20"/>
-        </w:rPr>
-        <w:t xml:space="preserve">7</w:t>
-      </w:r>
-    </w:p>
-    <w:p>
-      <w:pPr>
-        <w:spacing w:after="20"/>
-        <w:ind w:left="360"/>
-      </w:pPr>
-      <w:r>
-        <w:rPr>
-          <w:rFonts w:ascii="Calibri" w:cs="Calibri" w:eastAsia="Calibri" w:hAnsi="Calibri"/>
-          <w:color w:val="1A2733"/>
-          <w:sz w:val="20"/>
-          <w:szCs w:val="20"/>
-        </w:rPr>
-        <w:t xml:space="preserve">  ◯  B.  </w:t>
-      </w:r>
-      <w:r>
-        <w:rPr>
-          <w:rFonts w:ascii="Calibri" w:cs="Calibri" w:eastAsia="Calibri" w:hAnsi="Calibri"/>
-          <w:color w:val="1A2733"/>
-          <w:sz w:val="20"/>
-          <w:szCs w:val="20"/>
-        </w:rPr>
-        <w:t xml:space="preserve">10</w:t>
-      </w:r>
-    </w:p>
-    <w:p>
-      <w:pPr>
-        <w:spacing w:after="20"/>
-        <w:ind w:left="360"/>
-      </w:pPr>
-      <w:r>
-        <w:rPr>
-          <w:rFonts w:ascii="Calibri" w:cs="Calibri" w:eastAsia="Calibri" w:hAnsi="Calibri"/>
-          <w:color w:val="1A2733"/>
-          <w:sz w:val="20"/>
-          <w:szCs w:val="20"/>
-        </w:rPr>
-        <w:t xml:space="preserve">  ◯  C.  </w:t>
-      </w:r>
-      <w:r>
-        <w:rPr>
-          <w:rFonts w:ascii="Calibri" w:cs="Calibri" w:eastAsia="Calibri" w:hAnsi="Calibri"/>
-          <w:color w:val="1A2733"/>
-          <w:sz w:val="20"/>
-          <w:szCs w:val="20"/>
-        </w:rPr>
-        <w:t xml:space="preserve">25</w:t>
-      </w:r>
-    </w:p>
-    <w:p>
-      <w:pPr>
-        <w:spacing w:after="20"/>
-        <w:ind w:left="360"/>
-      </w:pPr>
-      <w:r>
-        <w:rPr>
-          <w:rFonts w:ascii="Calibri" w:cs="Calibri" w:eastAsia="Calibri" w:hAnsi="Calibri"/>
-          <w:color w:val="1A2733"/>
-          <w:sz w:val="20"/>
-          <w:szCs w:val="20"/>
-        </w:rPr>
-        <w:t xml:space="preserve">  ◯  D.  </w:t>
-      </w:r>
-      <w:r>
-        <w:rPr>
-          <w:rFonts w:ascii="Calibri" w:cs="Calibri" w:eastAsia="Calibri" w:hAnsi="Calibri"/>
-          <w:color w:val="1A2733"/>
-          <w:sz w:val="20"/>
-          <w:szCs w:val="20"/>
-        </w:rPr>
-        <w:t xml:space="preserve">52</w:t>
-      </w:r>
-    </w:p>
-    <w:p>
-      <w:pPr>
-        <w:spacing w:after="40" w:before="120"/>
-      </w:pPr>
-      <w:r>
-        <w:rPr>
-          <w:rFonts w:ascii="Calibri" w:cs="Calibri" w:eastAsia="Calibri" w:hAnsi="Calibri"/>
-          <w:b/>
-          <w:bCs/>
-          <w:color w:val="12355B"/>
-          <w:sz w:val="21"/>
-          <w:szCs w:val="21"/>
-        </w:rPr>
-        <w:t xml:space="preserve">3.  </w:t>
-      </w:r>
-      <w:r>
-        <w:rPr>
-          <w:rFonts w:ascii="Calibri" w:cs="Calibri" w:eastAsia="Calibri" w:hAnsi="Calibri"/>
-          <w:color w:val="1A2733"/>
-          <w:sz w:val="21"/>
-          <w:szCs w:val="21"/>
-        </w:rPr>
-        <w:t xml:space="preserve">A square floor is 8 tiles by 8 tiles. Write this as a power and find the total number of tiles.</w:t>
-      </w:r>
-    </w:p>
-    <w:p>
-      <w:pPr>
-        <w:spacing w:after="30" w:before="30"/>
-      </w:pPr>
-      <w:r>
-        <w:rPr>
-          <w:rFonts w:ascii="Calibri" w:cs="Calibri" w:eastAsia="Calibri" w:hAnsi="Calibri"/>
-          <w:b/>
-          <w:bCs/>
-          <w:color w:val="5F6F80"/>
-          <w:sz w:val="20"/>
-          <w:szCs w:val="20"/>
-        </w:rPr>
-        <w:t xml:space="preserve">Answer: </w:t>
-      </w:r>
-      <w:r>
-        <w:rPr>
-          <w:rFonts w:ascii="Calibri" w:cs="Calibri" w:eastAsia="Calibri" w:hAnsi="Calibri"/>
-          <w:color w:val="5F6F80"/>
-          <w:sz w:val="20"/>
-          <w:szCs w:val="20"/>
-        </w:rPr>
-        <w:t xml:space="preserve">____________________________</w:t>
+    <w:tbl>
+      <w:tblPr>
+        <w:tblW w:type="pct" w:w="100%"/>
+        <w:tblBorders>
+          <w:top w:val="single" w:color="BBD0DE" w:sz="6"/>
+          <w:left w:val="single" w:color="BBD0DE" w:sz="6"/>
+          <w:bottom w:val="single" w:color="BBD0DE" w:sz="6"/>
+          <w:right w:val="single" w:color="BBD0DE" w:sz="6"/>
+          <w:insideH w:val="none"/>
+          <w:insideV w:val="none"/>
+        </w:tblBorders>
+      </w:tblPr>
+      <w:tblGrid>
+        <w:gridCol w:w="100"/>
+      </w:tblGrid>
+      <w:tr>
+        <w:tc>
+          <w:tcPr>
+            <w:shd w:fill="EEF4F8" w:color="auto" w:val="clear"/>
+            <w:tcMar>
+              <w:top w:type="dxa" w:w="120"/>
+              <w:left w:type="dxa" w:w="160"/>
+              <w:bottom w:type="dxa" w:w="120"/>
+              <w:right w:type="dxa" w:w="160"/>
+            </w:tcMar>
+          </w:tcPr>
+          <w:p>
+            <w:pPr>
+              <w:spacing w:after="30"/>
+            </w:pPr>
+            <w:r>
+              <w:rPr>
+                <w:rFonts w:ascii="Calibri" w:cs="Calibri" w:eastAsia="Calibri" w:hAnsi="Calibri"/>
+                <w:b/>
+                <w:bCs/>
+                <w:color w:val="12355B"/>
+                <w:sz w:val="19"/>
+                <w:szCs w:val="19"/>
+              </w:rPr>
+              <w:t xml:space="preserve">Directions</w:t>
+            </w:r>
+          </w:p>
+          <w:p>
+            <w:r>
+              <w:rPr>
+                <w:rFonts w:ascii="Calibri" w:cs="Calibri" w:eastAsia="Calibri" w:hAnsi="Calibri"/>
+                <w:color w:val="1A2733"/>
+                <w:sz w:val="19"/>
+                <w:szCs w:val="19"/>
+              </w:rPr>
+              <w:t xml:space="preserve">Read each item carefully and answer it the way you would on the MCAP. For selected-response items, fill in the circle (○) next to the correct answer. For constructed-response items, enter your answer and show your work. Every item below assesses standard 6.EE.A.1.</w:t>
+            </w:r>
+          </w:p>
+        </w:tc>
+      </w:tr>
+    </w:tbl>
+    <w:p>
+      <w:pPr>
+        <w:spacing w:after="120"/>
+      </w:pPr>
+      <w:r>
+        <w:rPr>
+          <w:rFonts w:ascii="Calibri" w:cs="Calibri" w:eastAsia="Calibri" w:hAnsi="Calibri"/>
+          <w:color w:val="1A2733"/>
+          <w:sz w:val="21"/>
+          <w:szCs w:val="21"/>
+        </w:rPr>
+        <w:t xml:space="preserve"/>
+      </w:r>
+    </w:p>
+    <w:tbl>
+      <w:tblPr>
+        <w:tblW w:type="pct" w:w="100%"/>
+        <w:tblBorders>
+          <w:top w:val="single" w:color="C7D2DD" w:sz="6"/>
+          <w:left w:val="single" w:color="C7D2DD" w:sz="6"/>
+          <w:bottom w:val="single" w:color="C7D2DD" w:sz="6"/>
+          <w:right w:val="single" w:color="C7D2DD" w:sz="6"/>
+          <w:insideH w:val="none"/>
+          <w:insideV w:val="none"/>
+        </w:tblBorders>
+      </w:tblPr>
+      <w:tblGrid>
+        <w:gridCol w:w="100"/>
+      </w:tblGrid>
+      <w:tr>
+        <w:tc>
+          <w:tcPr>
+            <w:tcMar>
+              <w:top w:type="dxa" w:w="0"/>
+              <w:left w:type="dxa" w:w="0"/>
+              <w:bottom w:type="dxa" w:w="120"/>
+              <w:right w:type="dxa" w:w="160"/>
+            </w:tcMar>
+          </w:tcPr>
+          <w:p>
+            <w:pPr>
+              <w:shd w:fill="12355B" w:color="auto" w:val="clear"/>
+              <w:tabs>
+                <w:tab w:val="right" w:pos="9000"/>
+              </w:tabs>
+              <w:spacing w:after="30" w:before="30"/>
+              <w:ind w:left="120" w:right="120"/>
+            </w:pPr>
+            <w:r>
+              <w:rPr>
+                <w:rFonts w:ascii="Calibri" w:cs="Calibri" w:eastAsia="Calibri" w:hAnsi="Calibri"/>
+                <w:b/>
+                <w:bCs/>
+                <w:color w:val="FFFFFF"/>
+                <w:sz w:val="18"/>
+                <w:szCs w:val="18"/>
+              </w:rPr>
+              <w:t xml:space="preserve">Item 1</w:t>
+            </w:r>
+            <w:r>
+              <w:rPr>
+                <w:rFonts w:ascii="Calibri" w:cs="Calibri" w:eastAsia="Calibri" w:hAnsi="Calibri"/>
+                <w:color w:val="FFFFFF"/>
+                <w:sz w:val="18"/>
+                <w:szCs w:val="18"/>
+              </w:rPr>
+              <w:t xml:space="preserve">   |   </w:t>
+            </w:r>
+            <w:r>
+              <w:rPr>
+                <w:rFonts w:ascii="Calibri" w:cs="Calibri" w:eastAsia="Calibri" w:hAnsi="Calibri"/>
+                <w:color w:val="FFFFFF"/>
+                <w:spacing w:val="14"/>
+                <w:sz w:val="16"/>
+                <w:szCs w:val="16"/>
+              </w:rPr>
+              <w:t xml:space="preserve">SELECTED RESPONSE</w:t>
+            </w:r>
+            <w:r>
+              <w:rPr>
+                <w:rFonts w:ascii="Calibri" w:cs="Calibri" w:eastAsia="Calibri" w:hAnsi="Calibri"/>
+              </w:rPr>
+              <w:t xml:space="preserve">	</w:t>
+            </w:r>
+            <w:r>
+              <w:rPr>
+                <w:rFonts w:ascii="Calibri" w:cs="Calibri" w:eastAsia="Calibri" w:hAnsi="Calibri"/>
+                <w:b/>
+                <w:bCs/>
+                <w:color w:val="FFFFFF"/>
+                <w:sz w:val="17"/>
+                <w:szCs w:val="17"/>
+              </w:rPr>
+              <w:t xml:space="preserve">6.EE.A.1</w:t>
+            </w:r>
+          </w:p>
+          <w:p>
+            <w:pPr>
+              <w:spacing w:after="30" w:before="90"/>
+              <w:ind w:left="140" w:right="120"/>
+            </w:pPr>
+            <w:r>
+              <w:rPr>
+                <w:rFonts w:ascii="Calibri" w:cs="Calibri" w:eastAsia="Calibri" w:hAnsi="Calibri"/>
+                <w:b/>
+                <w:bCs/>
+                <w:color w:val="1A2733"/>
+                <w:sz w:val="21"/>
+                <w:szCs w:val="21"/>
+              </w:rPr>
+              <w:t xml:space="preserve">Which expression is equal to 2³?</w:t>
+            </w:r>
+          </w:p>
+          <w:p>
+            <w:pPr>
+              <w:spacing w:after="60"/>
+              <w:ind w:left="140" w:right="120"/>
+            </w:pPr>
+            <w:r>
+              <w:rPr>
+                <w:rFonts w:ascii="Calibri" w:cs="Calibri" w:eastAsia="Calibri" w:hAnsi="Calibri"/>
+                <w:i/>
+                <w:iCs/>
+                <w:color w:val="5F6F80"/>
+                <w:sz w:val="18"/>
+                <w:szCs w:val="18"/>
+              </w:rPr>
+              <w:t xml:space="preserve">Select the correct answer.</w:t>
+            </w:r>
+          </w:p>
+          <w:p>
+            <w:pPr>
+              <w:spacing w:after="24"/>
+              <w:ind w:left="380"/>
+            </w:pPr>
+            <w:r>
+              <w:rPr>
+                <w:rFonts w:ascii="Calibri" w:cs="Calibri" w:eastAsia="Calibri" w:hAnsi="Calibri"/>
+                <w:color w:val="12355B"/>
+                <w:sz w:val="22"/>
+                <w:szCs w:val="22"/>
+              </w:rPr>
+              <w:t xml:space="preserve">○  </w:t>
+            </w:r>
+            <w:r>
+              <w:rPr>
+                <w:rFonts w:ascii="Calibri" w:cs="Calibri" w:eastAsia="Calibri" w:hAnsi="Calibri"/>
+                <w:b/>
+                <w:bCs/>
+                <w:color w:val="1A2733"/>
+                <w:sz w:val="21"/>
+                <w:szCs w:val="21"/>
+              </w:rPr>
+              <w:t xml:space="preserve">A.  </w:t>
+            </w:r>
+            <w:r>
+              <w:rPr>
+                <w:rFonts w:ascii="Calibri" w:cs="Calibri" w:eastAsia="Calibri" w:hAnsi="Calibri"/>
+                <w:color w:val="1A2733"/>
+                <w:sz w:val="21"/>
+                <w:szCs w:val="21"/>
+              </w:rPr>
+              <w:t xml:space="preserve">2 × 3</w:t>
+            </w:r>
+          </w:p>
+          <w:p>
+            <w:pPr>
+              <w:spacing w:after="24"/>
+              <w:ind w:left="380"/>
+            </w:pPr>
+            <w:r>
+              <w:rPr>
+                <w:rFonts w:ascii="Calibri" w:cs="Calibri" w:eastAsia="Calibri" w:hAnsi="Calibri"/>
+                <w:color w:val="12355B"/>
+                <w:sz w:val="22"/>
+                <w:szCs w:val="22"/>
+              </w:rPr>
+              <w:t xml:space="preserve">○  </w:t>
+            </w:r>
+            <w:r>
+              <w:rPr>
+                <w:rFonts w:ascii="Calibri" w:cs="Calibri" w:eastAsia="Calibri" w:hAnsi="Calibri"/>
+                <w:b/>
+                <w:bCs/>
+                <w:color w:val="1A2733"/>
+                <w:sz w:val="21"/>
+                <w:szCs w:val="21"/>
+              </w:rPr>
+              <w:t xml:space="preserve">B.  </w:t>
+            </w:r>
+            <w:r>
+              <w:rPr>
+                <w:rFonts w:ascii="Calibri" w:cs="Calibri" w:eastAsia="Calibri" w:hAnsi="Calibri"/>
+                <w:color w:val="1A2733"/>
+                <w:sz w:val="21"/>
+                <w:szCs w:val="21"/>
+              </w:rPr>
+              <w:t xml:space="preserve">2 + 2 + 2</w:t>
+            </w:r>
+          </w:p>
+          <w:p>
+            <w:pPr>
+              <w:spacing w:after="24"/>
+              <w:ind w:left="380"/>
+            </w:pPr>
+            <w:r>
+              <w:rPr>
+                <w:rFonts w:ascii="Calibri" w:cs="Calibri" w:eastAsia="Calibri" w:hAnsi="Calibri"/>
+                <w:color w:val="12355B"/>
+                <w:sz w:val="22"/>
+                <w:szCs w:val="22"/>
+              </w:rPr>
+              <w:t xml:space="preserve">○  </w:t>
+            </w:r>
+            <w:r>
+              <w:rPr>
+                <w:rFonts w:ascii="Calibri" w:cs="Calibri" w:eastAsia="Calibri" w:hAnsi="Calibri"/>
+                <w:b/>
+                <w:bCs/>
+                <w:color w:val="1A2733"/>
+                <w:sz w:val="21"/>
+                <w:szCs w:val="21"/>
+              </w:rPr>
+              <w:t xml:space="preserve">C.  </w:t>
+            </w:r>
+            <w:r>
+              <w:rPr>
+                <w:rFonts w:ascii="Calibri" w:cs="Calibri" w:eastAsia="Calibri" w:hAnsi="Calibri"/>
+                <w:color w:val="1A2733"/>
+                <w:sz w:val="21"/>
+                <w:szCs w:val="21"/>
+              </w:rPr>
+              <w:t xml:space="preserve">2 × 2 × 2</w:t>
+            </w:r>
+          </w:p>
+          <w:p>
+            <w:pPr>
+              <w:spacing w:after="24"/>
+              <w:ind w:left="380"/>
+            </w:pPr>
+            <w:r>
+              <w:rPr>
+                <w:rFonts w:ascii="Calibri" w:cs="Calibri" w:eastAsia="Calibri" w:hAnsi="Calibri"/>
+                <w:color w:val="12355B"/>
+                <w:sz w:val="22"/>
+                <w:szCs w:val="22"/>
+              </w:rPr>
+              <w:t xml:space="preserve">○  </w:t>
+            </w:r>
+            <w:r>
+              <w:rPr>
+                <w:rFonts w:ascii="Calibri" w:cs="Calibri" w:eastAsia="Calibri" w:hAnsi="Calibri"/>
+                <w:b/>
+                <w:bCs/>
+                <w:color w:val="1A2733"/>
+                <w:sz w:val="21"/>
+                <w:szCs w:val="21"/>
+              </w:rPr>
+              <w:t xml:space="preserve">D.  </w:t>
+            </w:r>
+            <w:r>
+              <w:rPr>
+                <w:rFonts w:ascii="Calibri" w:cs="Calibri" w:eastAsia="Calibri" w:hAnsi="Calibri"/>
+                <w:color w:val="1A2733"/>
+                <w:sz w:val="21"/>
+                <w:szCs w:val="21"/>
+              </w:rPr>
+              <w:t xml:space="preserve">3 × 3</w:t>
+            </w:r>
+          </w:p>
+        </w:tc>
+      </w:tr>
+    </w:tbl>
+    <w:p>
+      <w:pPr>
+        <w:spacing w:after="100"/>
+      </w:pPr>
+      <w:r>
+        <w:rPr>
+          <w:rFonts w:ascii="Calibri" w:cs="Calibri" w:eastAsia="Calibri" w:hAnsi="Calibri"/>
+          <w:color w:val="1A2733"/>
+          <w:sz w:val="21"/>
+          <w:szCs w:val="21"/>
+        </w:rPr>
+        <w:t xml:space="preserve"/>
+      </w:r>
+    </w:p>
+    <w:tbl>
+      <w:tblPr>
+        <w:tblW w:type="pct" w:w="100%"/>
+        <w:tblBorders>
+          <w:top w:val="single" w:color="C7D2DD" w:sz="6"/>
+          <w:left w:val="single" w:color="C7D2DD" w:sz="6"/>
+          <w:bottom w:val="single" w:color="C7D2DD" w:sz="6"/>
+          <w:right w:val="single" w:color="C7D2DD" w:sz="6"/>
+          <w:insideH w:val="none"/>
+          <w:insideV w:val="none"/>
+        </w:tblBorders>
+      </w:tblPr>
+      <w:tblGrid>
+        <w:gridCol w:w="100"/>
+      </w:tblGrid>
+      <w:tr>
+        <w:tc>
+          <w:tcPr>
+            <w:tcMar>
+              <w:top w:type="dxa" w:w="0"/>
+              <w:left w:type="dxa" w:w="0"/>
+              <w:bottom w:type="dxa" w:w="120"/>
+              <w:right w:type="dxa" w:w="160"/>
+            </w:tcMar>
+          </w:tcPr>
+          <w:p>
+            <w:pPr>
+              <w:shd w:fill="12355B" w:color="auto" w:val="clear"/>
+              <w:tabs>
+                <w:tab w:val="right" w:pos="9000"/>
+              </w:tabs>
+              <w:spacing w:after="30" w:before="30"/>
+              <w:ind w:left="120" w:right="120"/>
+            </w:pPr>
+            <w:r>
+              <w:rPr>
+                <w:rFonts w:ascii="Calibri" w:cs="Calibri" w:eastAsia="Calibri" w:hAnsi="Calibri"/>
+                <w:b/>
+                <w:bCs/>
+                <w:color w:val="FFFFFF"/>
+                <w:sz w:val="18"/>
+                <w:szCs w:val="18"/>
+              </w:rPr>
+              <w:t xml:space="preserve">Item 2</w:t>
+            </w:r>
+            <w:r>
+              <w:rPr>
+                <w:rFonts w:ascii="Calibri" w:cs="Calibri" w:eastAsia="Calibri" w:hAnsi="Calibri"/>
+                <w:color w:val="FFFFFF"/>
+                <w:sz w:val="18"/>
+                <w:szCs w:val="18"/>
+              </w:rPr>
+              <w:t xml:space="preserve">   |   </w:t>
+            </w:r>
+            <w:r>
+              <w:rPr>
+                <w:rFonts w:ascii="Calibri" w:cs="Calibri" w:eastAsia="Calibri" w:hAnsi="Calibri"/>
+                <w:color w:val="FFFFFF"/>
+                <w:spacing w:val="14"/>
+                <w:sz w:val="16"/>
+                <w:szCs w:val="16"/>
+              </w:rPr>
+              <w:t xml:space="preserve">SELECTED RESPONSE</w:t>
+            </w:r>
+            <w:r>
+              <w:rPr>
+                <w:rFonts w:ascii="Calibri" w:cs="Calibri" w:eastAsia="Calibri" w:hAnsi="Calibri"/>
+              </w:rPr>
+              <w:t xml:space="preserve">	</w:t>
+            </w:r>
+            <w:r>
+              <w:rPr>
+                <w:rFonts w:ascii="Calibri" w:cs="Calibri" w:eastAsia="Calibri" w:hAnsi="Calibri"/>
+                <w:b/>
+                <w:bCs/>
+                <w:color w:val="FFFFFF"/>
+                <w:sz w:val="17"/>
+                <w:szCs w:val="17"/>
+              </w:rPr>
+              <w:t xml:space="preserve">6.EE.A.1</w:t>
+            </w:r>
+          </w:p>
+          <w:p>
+            <w:pPr>
+              <w:spacing w:after="30" w:before="90"/>
+              <w:ind w:left="140" w:right="120"/>
+            </w:pPr>
+            <w:r>
+              <w:rPr>
+                <w:rFonts w:ascii="Calibri" w:cs="Calibri" w:eastAsia="Calibri" w:hAnsi="Calibri"/>
+                <w:b/>
+                <w:bCs/>
+                <w:color w:val="1A2733"/>
+                <w:sz w:val="21"/>
+                <w:szCs w:val="21"/>
+              </w:rPr>
+              <w:t xml:space="preserve">What is the value of 5²?</w:t>
+            </w:r>
+          </w:p>
+          <w:p>
+            <w:pPr>
+              <w:spacing w:after="60"/>
+              <w:ind w:left="140" w:right="120"/>
+            </w:pPr>
+            <w:r>
+              <w:rPr>
+                <w:rFonts w:ascii="Calibri" w:cs="Calibri" w:eastAsia="Calibri" w:hAnsi="Calibri"/>
+                <w:i/>
+                <w:iCs/>
+                <w:color w:val="5F6F80"/>
+                <w:sz w:val="18"/>
+                <w:szCs w:val="18"/>
+              </w:rPr>
+              <w:t xml:space="preserve">Select the correct answer.</w:t>
+            </w:r>
+          </w:p>
+          <w:p>
+            <w:pPr>
+              <w:spacing w:after="24"/>
+              <w:ind w:left="380"/>
+            </w:pPr>
+            <w:r>
+              <w:rPr>
+                <w:rFonts w:ascii="Calibri" w:cs="Calibri" w:eastAsia="Calibri" w:hAnsi="Calibri"/>
+                <w:color w:val="12355B"/>
+                <w:sz w:val="22"/>
+                <w:szCs w:val="22"/>
+              </w:rPr>
+              <w:t xml:space="preserve">○  </w:t>
+            </w:r>
+            <w:r>
+              <w:rPr>
+                <w:rFonts w:ascii="Calibri" w:cs="Calibri" w:eastAsia="Calibri" w:hAnsi="Calibri"/>
+                <w:b/>
+                <w:bCs/>
+                <w:color w:val="1A2733"/>
+                <w:sz w:val="21"/>
+                <w:szCs w:val="21"/>
+              </w:rPr>
+              <w:t xml:space="preserve">A.  </w:t>
+            </w:r>
+            <w:r>
+              <w:rPr>
+                <w:rFonts w:ascii="Calibri" w:cs="Calibri" w:eastAsia="Calibri" w:hAnsi="Calibri"/>
+                <w:color w:val="1A2733"/>
+                <w:sz w:val="21"/>
+                <w:szCs w:val="21"/>
+              </w:rPr>
+              <w:t xml:space="preserve">7</w:t>
+            </w:r>
+          </w:p>
+          <w:p>
+            <w:pPr>
+              <w:spacing w:after="24"/>
+              <w:ind w:left="380"/>
+            </w:pPr>
+            <w:r>
+              <w:rPr>
+                <w:rFonts w:ascii="Calibri" w:cs="Calibri" w:eastAsia="Calibri" w:hAnsi="Calibri"/>
+                <w:color w:val="12355B"/>
+                <w:sz w:val="22"/>
+                <w:szCs w:val="22"/>
+              </w:rPr>
+              <w:t xml:space="preserve">○  </w:t>
+            </w:r>
+            <w:r>
+              <w:rPr>
+                <w:rFonts w:ascii="Calibri" w:cs="Calibri" w:eastAsia="Calibri" w:hAnsi="Calibri"/>
+                <w:b/>
+                <w:bCs/>
+                <w:color w:val="1A2733"/>
+                <w:sz w:val="21"/>
+                <w:szCs w:val="21"/>
+              </w:rPr>
+              <w:t xml:space="preserve">B.  </w:t>
+            </w:r>
+            <w:r>
+              <w:rPr>
+                <w:rFonts w:ascii="Calibri" w:cs="Calibri" w:eastAsia="Calibri" w:hAnsi="Calibri"/>
+                <w:color w:val="1A2733"/>
+                <w:sz w:val="21"/>
+                <w:szCs w:val="21"/>
+              </w:rPr>
+              <w:t xml:space="preserve">10</w:t>
+            </w:r>
+          </w:p>
+          <w:p>
+            <w:pPr>
+              <w:spacing w:after="24"/>
+              <w:ind w:left="380"/>
+            </w:pPr>
+            <w:r>
+              <w:rPr>
+                <w:rFonts w:ascii="Calibri" w:cs="Calibri" w:eastAsia="Calibri" w:hAnsi="Calibri"/>
+                <w:color w:val="12355B"/>
+                <w:sz w:val="22"/>
+                <w:szCs w:val="22"/>
+              </w:rPr>
+              <w:t xml:space="preserve">○  </w:t>
+            </w:r>
+            <w:r>
+              <w:rPr>
+                <w:rFonts w:ascii="Calibri" w:cs="Calibri" w:eastAsia="Calibri" w:hAnsi="Calibri"/>
+                <w:b/>
+                <w:bCs/>
+                <w:color w:val="1A2733"/>
+                <w:sz w:val="21"/>
+                <w:szCs w:val="21"/>
+              </w:rPr>
+              <w:t xml:space="preserve">C.  </w:t>
+            </w:r>
+            <w:r>
+              <w:rPr>
+                <w:rFonts w:ascii="Calibri" w:cs="Calibri" w:eastAsia="Calibri" w:hAnsi="Calibri"/>
+                <w:color w:val="1A2733"/>
+                <w:sz w:val="21"/>
+                <w:szCs w:val="21"/>
+              </w:rPr>
+              <w:t xml:space="preserve">25</w:t>
+            </w:r>
+          </w:p>
+          <w:p>
+            <w:pPr>
+              <w:spacing w:after="24"/>
+              <w:ind w:left="380"/>
+            </w:pPr>
+            <w:r>
+              <w:rPr>
+                <w:rFonts w:ascii="Calibri" w:cs="Calibri" w:eastAsia="Calibri" w:hAnsi="Calibri"/>
+                <w:color w:val="12355B"/>
+                <w:sz w:val="22"/>
+                <w:szCs w:val="22"/>
+              </w:rPr>
+              <w:t xml:space="preserve">○  </w:t>
+            </w:r>
+            <w:r>
+              <w:rPr>
+                <w:rFonts w:ascii="Calibri" w:cs="Calibri" w:eastAsia="Calibri" w:hAnsi="Calibri"/>
+                <w:b/>
+                <w:bCs/>
+                <w:color w:val="1A2733"/>
+                <w:sz w:val="21"/>
+                <w:szCs w:val="21"/>
+              </w:rPr>
+              <w:t xml:space="preserve">D.  </w:t>
+            </w:r>
+            <w:r>
+              <w:rPr>
+                <w:rFonts w:ascii="Calibri" w:cs="Calibri" w:eastAsia="Calibri" w:hAnsi="Calibri"/>
+                <w:color w:val="1A2733"/>
+                <w:sz w:val="21"/>
+                <w:szCs w:val="21"/>
+              </w:rPr>
+              <w:t xml:space="preserve">52</w:t>
+            </w:r>
+          </w:p>
+        </w:tc>
+      </w:tr>
+    </w:tbl>
+    <w:p>
+      <w:pPr>
+        <w:spacing w:after="100"/>
+      </w:pPr>
+      <w:r>
+        <w:rPr>
+          <w:rFonts w:ascii="Calibri" w:cs="Calibri" w:eastAsia="Calibri" w:hAnsi="Calibri"/>
+          <w:color w:val="1A2733"/>
+          <w:sz w:val="21"/>
+          <w:szCs w:val="21"/>
+        </w:rPr>
+        <w:t xml:space="preserve"/>
+      </w:r>
+    </w:p>
+    <w:tbl>
+      <w:tblPr>
+        <w:tblW w:type="pct" w:w="100%"/>
+        <w:tblBorders>
+          <w:top w:val="single" w:color="C7D2DD" w:sz="6"/>
+          <w:left w:val="single" w:color="C7D2DD" w:sz="6"/>
+          <w:bottom w:val="single" w:color="C7D2DD" w:sz="6"/>
+          <w:right w:val="single" w:color="C7D2DD" w:sz="6"/>
+          <w:insideH w:val="none"/>
+          <w:insideV w:val="none"/>
+        </w:tblBorders>
+      </w:tblPr>
+      <w:tblGrid>
+        <w:gridCol w:w="100"/>
+      </w:tblGrid>
+      <w:tr>
+        <w:tc>
+          <w:tcPr>
+            <w:tcMar>
+              <w:top w:type="dxa" w:w="0"/>
+              <w:left w:type="dxa" w:w="0"/>
+              <w:bottom w:type="dxa" w:w="120"/>
+              <w:right w:type="dxa" w:w="160"/>
+            </w:tcMar>
+          </w:tcPr>
+          <w:p>
+            <w:pPr>
+              <w:shd w:fill="12355B" w:color="auto" w:val="clear"/>
+              <w:tabs>
+                <w:tab w:val="right" w:pos="9000"/>
+              </w:tabs>
+              <w:spacing w:after="30" w:before="30"/>
+              <w:ind w:left="120" w:right="120"/>
+            </w:pPr>
+            <w:r>
+              <w:rPr>
+                <w:rFonts w:ascii="Calibri" w:cs="Calibri" w:eastAsia="Calibri" w:hAnsi="Calibri"/>
+                <w:b/>
+                <w:bCs/>
+                <w:color w:val="FFFFFF"/>
+                <w:sz w:val="18"/>
+                <w:szCs w:val="18"/>
+              </w:rPr>
+              <w:t xml:space="preserve">Item 3</w:t>
+            </w:r>
+            <w:r>
+              <w:rPr>
+                <w:rFonts w:ascii="Calibri" w:cs="Calibri" w:eastAsia="Calibri" w:hAnsi="Calibri"/>
+                <w:color w:val="FFFFFF"/>
+                <w:sz w:val="18"/>
+                <w:szCs w:val="18"/>
+              </w:rPr>
+              <w:t xml:space="preserve">   |   </w:t>
+            </w:r>
+            <w:r>
+              <w:rPr>
+                <w:rFonts w:ascii="Calibri" w:cs="Calibri" w:eastAsia="Calibri" w:hAnsi="Calibri"/>
+                <w:color w:val="FFFFFF"/>
+                <w:spacing w:val="14"/>
+                <w:sz w:val="16"/>
+                <w:szCs w:val="16"/>
+              </w:rPr>
+              <w:t xml:space="preserve">CONSTRUCTED RESPONSE</w:t>
+            </w:r>
+            <w:r>
+              <w:rPr>
+                <w:rFonts w:ascii="Calibri" w:cs="Calibri" w:eastAsia="Calibri" w:hAnsi="Calibri"/>
+              </w:rPr>
+              <w:t xml:space="preserve">	</w:t>
+            </w:r>
+            <w:r>
+              <w:rPr>
+                <w:rFonts w:ascii="Calibri" w:cs="Calibri" w:eastAsia="Calibri" w:hAnsi="Calibri"/>
+                <w:b/>
+                <w:bCs/>
+                <w:color w:val="FFFFFF"/>
+                <w:sz w:val="17"/>
+                <w:szCs w:val="17"/>
+              </w:rPr>
+              <w:t xml:space="preserve">6.EE.A.1</w:t>
+            </w:r>
+          </w:p>
+          <w:p>
+            <w:pPr>
+              <w:spacing w:after="30" w:before="90"/>
+              <w:ind w:left="140" w:right="120"/>
+            </w:pPr>
+            <w:r>
+              <w:rPr>
+                <w:rFonts w:ascii="Calibri" w:cs="Calibri" w:eastAsia="Calibri" w:hAnsi="Calibri"/>
+                <w:b/>
+                <w:bCs/>
+                <w:color w:val="1A2733"/>
+                <w:sz w:val="21"/>
+                <w:szCs w:val="21"/>
+              </w:rPr>
+              <w:t xml:space="preserve">A square floor is 8 tiles by 8 tiles. Write this as a power and find the total number of tiles.</w:t>
+            </w:r>
+          </w:p>
+          <w:p>
+            <w:pPr>
+              <w:spacing w:after="60"/>
+              <w:ind w:left="140" w:right="120"/>
+            </w:pPr>
+            <w:r>
+              <w:rPr>
+                <w:rFonts w:ascii="Calibri" w:cs="Calibri" w:eastAsia="Calibri" w:hAnsi="Calibri"/>
+                <w:i/>
+                <w:iCs/>
+                <w:color w:val="5F6F80"/>
+                <w:sz w:val="18"/>
+                <w:szCs w:val="18"/>
+              </w:rPr>
+              <w:t xml:space="preserve">Enter your answer in the space provided. Show your work.</w:t>
+            </w:r>
+          </w:p>
+          <w:p>
+            <w:pPr>
+              <w:pBdr>
+                <w:bottom w:val="single" w:color="AFBECC" w:sz="4" w:space="2"/>
+              </w:pBdr>
+              <w:spacing w:after="6" w:before="30" w:line="360"/>
+              <w:ind w:left="140" w:right="120"/>
+            </w:pPr>
+            <w:r>
+              <w:rPr>
+                <w:rFonts w:ascii="Calibri" w:cs="Calibri" w:eastAsia="Calibri" w:hAnsi="Calibri"/>
+                <w:color w:val="1A2733"/>
+                <w:sz w:val="21"/>
+                <w:szCs w:val="21"/>
+              </w:rPr>
+              <w:t xml:space="preserve"/>
+            </w:r>
+          </w:p>
+          <w:p>
+            <w:pPr>
+              <w:pBdr>
+                <w:bottom w:val="single" w:color="AFBECC" w:sz="4" w:space="2"/>
+              </w:pBdr>
+              <w:spacing w:after="0" w:line="360"/>
+              <w:ind w:left="140" w:right="120"/>
+            </w:pPr>
+            <w:r>
+              <w:rPr>
+                <w:rFonts w:ascii="Calibri" w:cs="Calibri" w:eastAsia="Calibri" w:hAnsi="Calibri"/>
+                <w:color w:val="1A2733"/>
+                <w:sz w:val="21"/>
+                <w:szCs w:val="21"/>
+              </w:rPr>
+              <w:t xml:space="preserve"/>
+            </w:r>
+          </w:p>
+        </w:tc>
+      </w:tr>
+    </w:tbl>
+    <w:p>
+      <w:pPr>
+        <w:spacing w:after="100"/>
+      </w:pPr>
+      <w:r>
+        <w:rPr>
+          <w:rFonts w:ascii="Calibri" w:cs="Calibri" w:eastAsia="Calibri" w:hAnsi="Calibri"/>
+          <w:color w:val="1A2733"/>
+          <w:sz w:val="21"/>
+          <w:szCs w:val="21"/>
+        </w:rPr>
+        <w:t xml:space="preserve"/>
       </w:r>
     </w:p>
     <w:p>
@@ -1920,7 +2397,7 @@
           <w:sz w:val="20"/>
           <w:szCs w:val="20"/>
         </w:rPr>
-        <w:t xml:space="preserve">MCAP-Style Practice: </w:t>
+        <w:t xml:space="preserve">MCAP-Style Practice (6.EE.A.1): </w:t>
       </w:r>
     </w:p>
     <w:p>
@@ -1937,7 +2414,16 @@
           <w:sz w:val="19"/>
           <w:szCs w:val="19"/>
         </w:rPr>
-        <w:t xml:space="preserve">1. </w:t>
+        <w:t xml:space="preserve">Item 1 </w:t>
+      </w:r>
+      <w:r>
+        <w:rPr>
+          <w:rFonts w:ascii="Calibri" w:cs="Calibri" w:eastAsia="Calibri" w:hAnsi="Calibri"/>
+          <w:color w:val="5F6F80"/>
+          <w:sz w:val="17"/>
+          <w:szCs w:val="17"/>
+        </w:rPr>
+        <w:t xml:space="preserve">(Selected Response): </w:t>
       </w:r>
       <w:r>
         <w:rPr>
@@ -1974,7 +2460,16 @@
           <w:sz w:val="19"/>
           <w:szCs w:val="19"/>
         </w:rPr>
-        <w:t xml:space="preserve">2. </w:t>
+        <w:t xml:space="preserve">Item 2 </w:t>
+      </w:r>
+      <w:r>
+        <w:rPr>
+          <w:rFonts w:ascii="Calibri" w:cs="Calibri" w:eastAsia="Calibri" w:hAnsi="Calibri"/>
+          <w:color w:val="5F6F80"/>
+          <w:sz w:val="17"/>
+          <w:szCs w:val="17"/>
+        </w:rPr>
+        <w:t xml:space="preserve">(Selected Response): </w:t>
       </w:r>
       <w:r>
         <w:rPr>
@@ -2011,7 +2506,16 @@
           <w:sz w:val="19"/>
           <w:szCs w:val="19"/>
         </w:rPr>
-        <w:t xml:space="preserve">3. </w:t>
+        <w:t xml:space="preserve">Item 3 </w:t>
+      </w:r>
+      <w:r>
+        <w:rPr>
+          <w:rFonts w:ascii="Calibri" w:cs="Calibri" w:eastAsia="Calibri" w:hAnsi="Calibri"/>
+          <w:color w:val="5F6F80"/>
+          <w:sz w:val="17"/>
+          <w:szCs w:val="17"/>
+        </w:rPr>
+        <w:t xml:space="preserve">(Constructed Response): </w:t>
       </w:r>
       <w:r>
         <w:rPr>

</xml_diff>